<commit_message>
Updated checklists with missions and new series bullets
</commit_message>
<xml_diff>
--- a/checklists.docx
+++ b/checklists.docx
@@ -133,33 +133,6 @@
       <w:r>
         <w:t>for BSF (Fall thru Spring)</w:t>
       </w:r>
-    </w:p>
-    <w:p>
-      <w:pPr>
-        <w:pStyle w:val="ListParagraph"/>
-      </w:pPr>
-    </w:p>
-    <w:p>
-      <w:pPr>
-        <w:pStyle w:val="Heading2"/>
-      </w:pPr>
-      <w:r>
-        <w:t>New Series</w:t>
-      </w:r>
-    </w:p>
-    <w:p>
-      <w:pPr>
-        <w:pStyle w:val="ListParagraph"/>
-        <w:numPr>
-          <w:ilvl w:val="0"/>
-          <w:numId w:val="6"/>
-        </w:numPr>
-      </w:pPr>
-      <w:r>
-        <w:t>Update the 9x.0 light cues to match series graphics</w:t>
-      </w:r>
-    </w:p>
-    <w:p>
       <w:r>
         <w:br w:type="page"/>
       </w:r>
@@ -429,7 +402,56 @@
       <w:r>
         <w:t>Edit ProPresenter theme “1_uac_series” – change all fonts to series font, change all graphics to the corresponding series graphic. (L3 for scripture Lower third, L4 for name plates). L4 is skinnier.</w:t>
       </w:r>
-    </w:p>
+      <w:r>
+        <w:t xml:space="preserve"> If there isn’t an L4 version, use the L3 version but set it 100 pixels lower on the screen.</w:t>
+      </w:r>
+    </w:p>
+    <w:p/>
+    <w:p>
+      <w:pPr>
+        <w:pStyle w:val="Heading2"/>
+      </w:pPr>
+      <w:r>
+        <w:t>Missions Sunday</w:t>
+      </w:r>
+    </w:p>
+    <w:p>
+      <w:pPr>
+        <w:pStyle w:val="ListParagraph"/>
+        <w:numPr>
+          <w:ilvl w:val="0"/>
+          <w:numId w:val="13"/>
+        </w:numPr>
+      </w:pPr>
+      <w:r>
+        <w:t>Ensure that all graphics for things like “Prayer”, “Scripture” and “Listen” use the Missions version of those graphics rather than the current series.</w:t>
+      </w:r>
+    </w:p>
+    <w:p>
+      <w:pPr>
+        <w:pStyle w:val="ListParagraph"/>
+        <w:numPr>
+          <w:ilvl w:val="0"/>
+          <w:numId w:val="13"/>
+        </w:numPr>
+      </w:pPr>
+      <w:r>
+        <w:t xml:space="preserve">Ensure that you use the “Missions” version of standard light cues rather than “Series” version. </w:t>
+      </w:r>
+    </w:p>
+    <w:p>
+      <w:pPr>
+        <w:pStyle w:val="ListParagraph"/>
+        <w:numPr>
+          <w:ilvl w:val="0"/>
+          <w:numId w:val="13"/>
+        </w:numPr>
+      </w:pPr>
+      <w:r>
+        <w:t>The Inverse of this is the week after “Missions Sunday”, you need to ensure they are all reverted to the series versions.</w:t>
+      </w:r>
+    </w:p>
+    <w:p/>
     <w:p/>
     <w:p>
       <w:pPr>
@@ -441,6 +463,7 @@
         </w:rPr>
       </w:pPr>
       <w:r>
+        <w:lastRenderedPageBreak/>
         <w:br w:type="page"/>
       </w:r>
     </w:p>
@@ -706,6 +729,73 @@
         <w:t xml:space="preserve"> uploaded video, podcast and publish webpage)</w:t>
       </w:r>
     </w:p>
+    <w:p/>
+    <w:p>
+      <w:pPr>
+        <w:pStyle w:val="Heading2"/>
+      </w:pPr>
+      <w:r>
+        <w:t>New Series</w:t>
+      </w:r>
+    </w:p>
+    <w:p>
+      <w:pPr>
+        <w:pStyle w:val="ListParagraph"/>
+        <w:numPr>
+          <w:ilvl w:val="0"/>
+          <w:numId w:val="14"/>
+        </w:numPr>
+      </w:pPr>
+      <w:r>
+        <w:t xml:space="preserve">Ensure that you are using new series background graphic for the MP1 graphic. It is used as the background for </w:t>
+      </w:r>
+      <w:proofErr w:type="spellStart"/>
+      <w:r>
+        <w:t>SuperSource</w:t>
+      </w:r>
+      <w:proofErr w:type="spellEnd"/>
+      <w:r>
+        <w:t>.</w:t>
+      </w:r>
+    </w:p>
+    <w:p>
+      <w:pPr>
+        <w:pStyle w:val="Heading2"/>
+      </w:pPr>
+      <w:r>
+        <w:t>Missions Sunday</w:t>
+      </w:r>
+    </w:p>
+    <w:p>
+      <w:pPr>
+        <w:pStyle w:val="ListParagraph"/>
+        <w:numPr>
+          <w:ilvl w:val="0"/>
+          <w:numId w:val="14"/>
+        </w:numPr>
+      </w:pPr>
+      <w:r>
+        <w:t xml:space="preserve">Ensure that you are using </w:t>
+      </w:r>
+      <w:r>
+        <w:t xml:space="preserve">Missions Sunday </w:t>
+      </w:r>
+      <w:r>
+        <w:t xml:space="preserve">background graphic for the MP1 graphic. It is used as the background for </w:t>
+      </w:r>
+      <w:proofErr w:type="spellStart"/>
+      <w:r>
+        <w:t>SuperSource</w:t>
+      </w:r>
+      <w:proofErr w:type="spellEnd"/>
+      <w:r>
+        <w:t>.</w:t>
+      </w:r>
+      <w:r>
+        <w:t xml:space="preserve"> Also for the week following Missions Sunday ensure that MP1 has been reset to the series.</w:t>
+      </w:r>
+    </w:p>
+    <w:p/>
     <w:p>
       <w:pPr>
         <w:pStyle w:val="ListParagraph"/>
@@ -937,6 +1027,18 @@
       </w:pPr>
       <w:r>
         <w:t xml:space="preserve">All light cues look good – nothing funky left over from something before </w:t>
+      </w:r>
+    </w:p>
+    <w:p>
+      <w:pPr>
+        <w:pStyle w:val="ListParagraph"/>
+        <w:numPr>
+          <w:ilvl w:val="0"/>
+          <w:numId w:val="7"/>
+        </w:numPr>
+      </w:pPr>
+      <w:r>
+        <w:t>Verify that all fixtures are working.</w:t>
       </w:r>
     </w:p>
     <w:p>
@@ -1299,7 +1401,7 @@
         <w:rPr>
           <w:noProof/>
         </w:rPr>
-        <w:t>2025-03-02 3:08:00 PM</w:t>
+        <w:t>2026-03-08 11:21:00 AM</w:t>
       </w:r>
     </w:fldSimple>
     <w:r>
@@ -2464,6 +2566,232 @@
     </w:lvl>
   </w:abstractNum>
   <w:abstractNum w:abstractNumId="10" w15:restartNumberingAfterBreak="0">
+    <w:nsid w:val="6C9306B5"/>
+    <w:multiLevelType w:val="hybridMultilevel"/>
+    <w:tmpl w:val="EDECF72E"/>
+    <w:lvl w:ilvl="0" w:tplc="04090001">
+      <w:start w:val="1"/>
+      <w:numFmt w:val="bullet"/>
+      <w:lvlText w:val=""/>
+      <w:lvlJc w:val="left"/>
+      <w:pPr>
+        <w:ind w:left="720" w:hanging="360"/>
+      </w:pPr>
+      <w:rPr>
+        <w:rFonts w:ascii="Symbol" w:hAnsi="Symbol" w:hint="default"/>
+      </w:rPr>
+    </w:lvl>
+    <w:lvl w:ilvl="1" w:tplc="04090003" w:tentative="1">
+      <w:start w:val="1"/>
+      <w:numFmt w:val="bullet"/>
+      <w:lvlText w:val="o"/>
+      <w:lvlJc w:val="left"/>
+      <w:pPr>
+        <w:ind w:left="1440" w:hanging="360"/>
+      </w:pPr>
+      <w:rPr>
+        <w:rFonts w:ascii="Courier New" w:hAnsi="Courier New" w:cs="Courier New" w:hint="default"/>
+      </w:rPr>
+    </w:lvl>
+    <w:lvl w:ilvl="2" w:tplc="04090005" w:tentative="1">
+      <w:start w:val="1"/>
+      <w:numFmt w:val="bullet"/>
+      <w:lvlText w:val=""/>
+      <w:lvlJc w:val="left"/>
+      <w:pPr>
+        <w:ind w:left="2160" w:hanging="360"/>
+      </w:pPr>
+      <w:rPr>
+        <w:rFonts w:ascii="Wingdings" w:hAnsi="Wingdings" w:hint="default"/>
+      </w:rPr>
+    </w:lvl>
+    <w:lvl w:ilvl="3" w:tplc="04090001" w:tentative="1">
+      <w:start w:val="1"/>
+      <w:numFmt w:val="bullet"/>
+      <w:lvlText w:val=""/>
+      <w:lvlJc w:val="left"/>
+      <w:pPr>
+        <w:ind w:left="2880" w:hanging="360"/>
+      </w:pPr>
+      <w:rPr>
+        <w:rFonts w:ascii="Symbol" w:hAnsi="Symbol" w:hint="default"/>
+      </w:rPr>
+    </w:lvl>
+    <w:lvl w:ilvl="4" w:tplc="04090003" w:tentative="1">
+      <w:start w:val="1"/>
+      <w:numFmt w:val="bullet"/>
+      <w:lvlText w:val="o"/>
+      <w:lvlJc w:val="left"/>
+      <w:pPr>
+        <w:ind w:left="3600" w:hanging="360"/>
+      </w:pPr>
+      <w:rPr>
+        <w:rFonts w:ascii="Courier New" w:hAnsi="Courier New" w:cs="Courier New" w:hint="default"/>
+      </w:rPr>
+    </w:lvl>
+    <w:lvl w:ilvl="5" w:tplc="04090005" w:tentative="1">
+      <w:start w:val="1"/>
+      <w:numFmt w:val="bullet"/>
+      <w:lvlText w:val=""/>
+      <w:lvlJc w:val="left"/>
+      <w:pPr>
+        <w:ind w:left="4320" w:hanging="360"/>
+      </w:pPr>
+      <w:rPr>
+        <w:rFonts w:ascii="Wingdings" w:hAnsi="Wingdings" w:hint="default"/>
+      </w:rPr>
+    </w:lvl>
+    <w:lvl w:ilvl="6" w:tplc="04090001" w:tentative="1">
+      <w:start w:val="1"/>
+      <w:numFmt w:val="bullet"/>
+      <w:lvlText w:val=""/>
+      <w:lvlJc w:val="left"/>
+      <w:pPr>
+        <w:ind w:left="5040" w:hanging="360"/>
+      </w:pPr>
+      <w:rPr>
+        <w:rFonts w:ascii="Symbol" w:hAnsi="Symbol" w:hint="default"/>
+      </w:rPr>
+    </w:lvl>
+    <w:lvl w:ilvl="7" w:tplc="04090003" w:tentative="1">
+      <w:start w:val="1"/>
+      <w:numFmt w:val="bullet"/>
+      <w:lvlText w:val="o"/>
+      <w:lvlJc w:val="left"/>
+      <w:pPr>
+        <w:ind w:left="5760" w:hanging="360"/>
+      </w:pPr>
+      <w:rPr>
+        <w:rFonts w:ascii="Courier New" w:hAnsi="Courier New" w:cs="Courier New" w:hint="default"/>
+      </w:rPr>
+    </w:lvl>
+    <w:lvl w:ilvl="8" w:tplc="04090005" w:tentative="1">
+      <w:start w:val="1"/>
+      <w:numFmt w:val="bullet"/>
+      <w:lvlText w:val=""/>
+      <w:lvlJc w:val="left"/>
+      <w:pPr>
+        <w:ind w:left="6480" w:hanging="360"/>
+      </w:pPr>
+      <w:rPr>
+        <w:rFonts w:ascii="Wingdings" w:hAnsi="Wingdings" w:hint="default"/>
+      </w:rPr>
+    </w:lvl>
+  </w:abstractNum>
+  <w:abstractNum w:abstractNumId="11" w15:restartNumberingAfterBreak="0">
+    <w:nsid w:val="77A66FF0"/>
+    <w:multiLevelType w:val="hybridMultilevel"/>
+    <w:tmpl w:val="541C1BD8"/>
+    <w:lvl w:ilvl="0" w:tplc="04090001">
+      <w:start w:val="1"/>
+      <w:numFmt w:val="bullet"/>
+      <w:lvlText w:val=""/>
+      <w:lvlJc w:val="left"/>
+      <w:pPr>
+        <w:ind w:left="720" w:hanging="360"/>
+      </w:pPr>
+      <w:rPr>
+        <w:rFonts w:ascii="Symbol" w:hAnsi="Symbol" w:hint="default"/>
+      </w:rPr>
+    </w:lvl>
+    <w:lvl w:ilvl="1" w:tplc="04090003" w:tentative="1">
+      <w:start w:val="1"/>
+      <w:numFmt w:val="bullet"/>
+      <w:lvlText w:val="o"/>
+      <w:lvlJc w:val="left"/>
+      <w:pPr>
+        <w:ind w:left="1440" w:hanging="360"/>
+      </w:pPr>
+      <w:rPr>
+        <w:rFonts w:ascii="Courier New" w:hAnsi="Courier New" w:cs="Courier New" w:hint="default"/>
+      </w:rPr>
+    </w:lvl>
+    <w:lvl w:ilvl="2" w:tplc="04090005" w:tentative="1">
+      <w:start w:val="1"/>
+      <w:numFmt w:val="bullet"/>
+      <w:lvlText w:val=""/>
+      <w:lvlJc w:val="left"/>
+      <w:pPr>
+        <w:ind w:left="2160" w:hanging="360"/>
+      </w:pPr>
+      <w:rPr>
+        <w:rFonts w:ascii="Wingdings" w:hAnsi="Wingdings" w:hint="default"/>
+      </w:rPr>
+    </w:lvl>
+    <w:lvl w:ilvl="3" w:tplc="04090001" w:tentative="1">
+      <w:start w:val="1"/>
+      <w:numFmt w:val="bullet"/>
+      <w:lvlText w:val=""/>
+      <w:lvlJc w:val="left"/>
+      <w:pPr>
+        <w:ind w:left="2880" w:hanging="360"/>
+      </w:pPr>
+      <w:rPr>
+        <w:rFonts w:ascii="Symbol" w:hAnsi="Symbol" w:hint="default"/>
+      </w:rPr>
+    </w:lvl>
+    <w:lvl w:ilvl="4" w:tplc="04090003" w:tentative="1">
+      <w:start w:val="1"/>
+      <w:numFmt w:val="bullet"/>
+      <w:lvlText w:val="o"/>
+      <w:lvlJc w:val="left"/>
+      <w:pPr>
+        <w:ind w:left="3600" w:hanging="360"/>
+      </w:pPr>
+      <w:rPr>
+        <w:rFonts w:ascii="Courier New" w:hAnsi="Courier New" w:cs="Courier New" w:hint="default"/>
+      </w:rPr>
+    </w:lvl>
+    <w:lvl w:ilvl="5" w:tplc="04090005" w:tentative="1">
+      <w:start w:val="1"/>
+      <w:numFmt w:val="bullet"/>
+      <w:lvlText w:val=""/>
+      <w:lvlJc w:val="left"/>
+      <w:pPr>
+        <w:ind w:left="4320" w:hanging="360"/>
+      </w:pPr>
+      <w:rPr>
+        <w:rFonts w:ascii="Wingdings" w:hAnsi="Wingdings" w:hint="default"/>
+      </w:rPr>
+    </w:lvl>
+    <w:lvl w:ilvl="6" w:tplc="04090001" w:tentative="1">
+      <w:start w:val="1"/>
+      <w:numFmt w:val="bullet"/>
+      <w:lvlText w:val=""/>
+      <w:lvlJc w:val="left"/>
+      <w:pPr>
+        <w:ind w:left="5040" w:hanging="360"/>
+      </w:pPr>
+      <w:rPr>
+        <w:rFonts w:ascii="Symbol" w:hAnsi="Symbol" w:hint="default"/>
+      </w:rPr>
+    </w:lvl>
+    <w:lvl w:ilvl="7" w:tplc="04090003" w:tentative="1">
+      <w:start w:val="1"/>
+      <w:numFmt w:val="bullet"/>
+      <w:lvlText w:val="o"/>
+      <w:lvlJc w:val="left"/>
+      <w:pPr>
+        <w:ind w:left="5760" w:hanging="360"/>
+      </w:pPr>
+      <w:rPr>
+        <w:rFonts w:ascii="Courier New" w:hAnsi="Courier New" w:cs="Courier New" w:hint="default"/>
+      </w:rPr>
+    </w:lvl>
+    <w:lvl w:ilvl="8" w:tplc="04090005" w:tentative="1">
+      <w:start w:val="1"/>
+      <w:numFmt w:val="bullet"/>
+      <w:lvlText w:val=""/>
+      <w:lvlJc w:val="left"/>
+      <w:pPr>
+        <w:ind w:left="6480" w:hanging="360"/>
+      </w:pPr>
+      <w:rPr>
+        <w:rFonts w:ascii="Wingdings" w:hAnsi="Wingdings" w:hint="default"/>
+      </w:rPr>
+    </w:lvl>
+  </w:abstractNum>
+  <w:abstractNum w:abstractNumId="12" w15:restartNumberingAfterBreak="0">
     <w:nsid w:val="78372AE7"/>
     <w:multiLevelType w:val="hybridMultilevel"/>
     <w:tmpl w:val="A69E72BE"/>
@@ -2576,7 +2904,7 @@
       </w:rPr>
     </w:lvl>
   </w:abstractNum>
-  <w:abstractNum w:abstractNumId="11" w15:restartNumberingAfterBreak="0">
+  <w:abstractNum w:abstractNumId="13" w15:restartNumberingAfterBreak="0">
     <w:nsid w:val="7CAC2DE3"/>
     <w:multiLevelType w:val="hybridMultilevel"/>
     <w:tmpl w:val="1A3A770E"/>
@@ -2699,7 +3027,7 @@
     <w:abstractNumId w:val="7"/>
   </w:num>
   <w:num w:numId="4" w16cid:durableId="1943029150">
-    <w:abstractNumId w:val="10"/>
+    <w:abstractNumId w:val="12"/>
   </w:num>
   <w:num w:numId="5" w16cid:durableId="1010789479">
     <w:abstractNumId w:val="9"/>
@@ -2717,13 +3045,19 @@
     <w:abstractNumId w:val="6"/>
   </w:num>
   <w:num w:numId="10" w16cid:durableId="1105223522">
-    <w:abstractNumId w:val="11"/>
+    <w:abstractNumId w:val="13"/>
   </w:num>
   <w:num w:numId="11" w16cid:durableId="1603759077">
     <w:abstractNumId w:val="2"/>
   </w:num>
   <w:num w:numId="12" w16cid:durableId="2082364841">
     <w:abstractNumId w:val="8"/>
+  </w:num>
+  <w:num w:numId="13" w16cid:durableId="1905021052">
+    <w:abstractNumId w:val="10"/>
+  </w:num>
+  <w:num w:numId="14" w16cid:durableId="1434745183">
+    <w:abstractNumId w:val="11"/>
   </w:num>
 </w:numbering>
 </file>

</xml_diff>